<commit_message>
Step 2 and fixed some stuff
</commit_message>
<xml_diff>
--- a/The Structural Dynamics of Option.docx
+++ b/The Structural Dynamics of Option.docx
@@ -398,13 +398,7 @@
                     <w:rPr>
                       <w:rFonts w:ascii="Cambria Math" w:hAnsi="Cambria Math"/>
                     </w:rPr>
-                    <m:t>r</m:t>
-                  </m:r>
-                  <m:r>
-                    <w:rPr>
-                      <w:rFonts w:ascii="Cambria Math" w:hAnsi="Cambria Math"/>
-                    </w:rPr>
-                    <m:t xml:space="preserve"> +</m:t>
+                    <m:t>r +</m:t>
                   </m:r>
                   <m:f>
                     <m:fPr>
@@ -564,19 +558,7 @@
             <w:rPr>
               <w:rFonts w:ascii="Cambria Math" w:hAnsi="Cambria Math"/>
             </w:rPr>
-            <m:t>-</m:t>
-          </m:r>
-          <m:r>
-            <w:rPr>
-              <w:rFonts w:ascii="Cambria Math" w:hAnsi="Cambria Math"/>
-            </w:rPr>
-            <m:t xml:space="preserve"> </m:t>
-          </m:r>
-          <m:r>
-            <w:rPr>
-              <w:rFonts w:ascii="Cambria Math" w:hAnsi="Cambria Math"/>
-            </w:rPr>
-            <m:t>σ</m:t>
+            <m:t>- σ</m:t>
           </m:r>
           <m:rad>
             <m:radPr>
@@ -2282,13 +2264,173 @@
         <w:t>.</w:t>
       </w:r>
     </w:p>
+    <w:p>
+      <w:pPr>
+        <w:rPr>
+          <w:rFonts w:ascii="Calibri" w:eastAsiaTheme="majorEastAsia" w:hAnsi="Calibri" w:cstheme="majorBidi"/>
+          <w:lang w:eastAsia="it-IT"/>
+        </w:rPr>
+      </w:pPr>
+      <w:r>
+        <w:rPr>
+          <w:rFonts w:ascii="Calibri" w:eastAsiaTheme="majorEastAsia" w:hAnsi="Calibri" w:cstheme="majorBidi"/>
+          <w:lang w:eastAsia="it-IT"/>
+        </w:rPr>
+        <w:lastRenderedPageBreak/>
+        <w:br w:type="page"/>
+      </w:r>
+    </w:p>
+    <w:p>
+      <w:pPr>
+        <w:pStyle w:val="Heading1"/>
+        <w:rPr>
+          <w:lang w:eastAsia="it-IT"/>
+        </w:rPr>
+      </w:pPr>
+      <w:r>
+        <w:rPr>
+          <w:lang w:eastAsia="it-IT"/>
+        </w:rPr>
+        <w:lastRenderedPageBreak/>
+        <w:t xml:space="preserve">First meeting notes </w:t>
+      </w:r>
+    </w:p>
+    <w:p>
+      <w:r>
+        <w:t xml:space="preserve">Event study starting from options valued at B&amp;S </w:t>
+      </w:r>
+    </w:p>
+    <w:p>
+      <w:r>
+        <w:t>Only focusing on 2-3 events</w:t>
+      </w:r>
+      <w:r>
+        <w:t>. For each event:</w:t>
+      </w:r>
+    </w:p>
+    <w:p>
+      <w:pPr>
+        <w:pStyle w:val="ListParagraph"/>
+        <w:numPr>
+          <w:ilvl w:val="0"/>
+          <w:numId w:val="10"/>
+        </w:numPr>
+      </w:pPr>
+      <w:r>
+        <w:t>Overlay charts</w:t>
+      </w:r>
+      <w:r>
+        <w:t xml:space="preserve"> in 2d </w:t>
+      </w:r>
+    </w:p>
+    <w:p>
+      <w:pPr>
+        <w:pStyle w:val="ListParagraph"/>
+        <w:numPr>
+          <w:ilvl w:val="0"/>
+          <w:numId w:val="10"/>
+        </w:numPr>
+      </w:pPr>
+      <w:r>
+        <w:t xml:space="preserve">Skew t-test </w:t>
+      </w:r>
+    </w:p>
+    <w:p>
+      <w:pPr>
+        <w:pStyle w:val="ListParagraph"/>
+        <w:numPr>
+          <w:ilvl w:val="0"/>
+          <w:numId w:val="10"/>
+        </w:numPr>
+      </w:pPr>
+      <w:r>
+        <w:t>Kurt t-test</w:t>
+      </w:r>
+    </w:p>
+    <w:p>
+      <w:r>
+        <w:t>Trying different models of valuing the options:</w:t>
+      </w:r>
+    </w:p>
+    <w:p>
+      <w:r>
+        <w:t xml:space="preserve">Using </w:t>
+      </w:r>
+      <w:r>
+        <w:t>Heston</w:t>
+      </w:r>
+      <w:r>
+        <w:t xml:space="preserve"> </w:t>
+      </w:r>
+      <w:r>
+        <w:t xml:space="preserve">model </w:t>
+      </w:r>
+      <w:r>
+        <w:t xml:space="preserve">to get out the </w:t>
+      </w:r>
+      <w:r>
+        <w:t xml:space="preserve">IVPDF </w:t>
+      </w:r>
+      <w:r>
+        <w:t xml:space="preserve">from it </w:t>
+      </w:r>
+    </w:p>
+    <w:p>
+      <w:pPr>
+        <w:rPr>
+          <w:color w:val="467886" w:themeColor="hyperlink"/>
+          <w:u w:val="single"/>
+        </w:rPr>
+      </w:pPr>
+      <w:r>
+        <w:t>Depending on how quickly it takes me to do this I can try and model it under CEV (</w:t>
+      </w:r>
+      <w:hyperlink r:id="rId10" w:history="1">
+        <w:r>
+          <w:rPr>
+            <w:rStyle w:val="Hyperlink"/>
+          </w:rPr>
+          <w:t>Constant elasticity of variance model</w:t>
+        </w:r>
+      </w:hyperlink>
+      <w:r>
+        <w:t>)</w:t>
+      </w:r>
+      <w:r>
+        <w:t xml:space="preserve"> and If </w:t>
+      </w:r>
+      <w:r>
+        <w:t>there is even more time try the</w:t>
+      </w:r>
+      <w:r>
+        <w:t xml:space="preserve"> Bates model (</w:t>
+      </w:r>
+      <w:hyperlink r:id="rId11" w:history="1">
+        <w:r>
+          <w:rPr>
+            <w:rStyle w:val="Hyperlink"/>
+          </w:rPr>
+          <w:t>Stochastic volatility jump</w:t>
+        </w:r>
+      </w:hyperlink>
+      <w:r>
+        <w:t>)</w:t>
+      </w:r>
+    </w:p>
+    <w:p>
+      <w:pPr>
+        <w:rPr>
+          <w:lang w:eastAsia="it-IT"/>
+        </w:rPr>
+      </w:pPr>
+    </w:p>
     <w:sectPr>
-      <w:headerReference w:type="even" r:id="rId10"/>
-      <w:headerReference w:type="default" r:id="rId11"/>
-      <w:footerReference w:type="even" r:id="rId12"/>
-      <w:footerReference w:type="default" r:id="rId13"/>
-      <w:headerReference w:type="first" r:id="rId14"/>
-      <w:footerReference w:type="first" r:id="rId15"/>
+      <w:headerReference w:type="even" r:id="rId12"/>
+      <w:headerReference w:type="default" r:id="rId13"/>
+      <w:footerReference w:type="even" r:id="rId14"/>
+      <w:footerReference w:type="default" r:id="rId15"/>
+      <w:headerReference w:type="first" r:id="rId16"/>
+      <w:footerReference w:type="first" r:id="rId17"/>
       <w:pgSz w:w="12240" w:h="15840"/>
       <w:pgMar w:top="1417" w:right="1134" w:bottom="1134" w:left="1134" w:header="708" w:footer="708" w:gutter="0"/>
       <w:cols w:space="708"/>
@@ -3093,6 +3235,119 @@
     </w:lvl>
   </w:abstractNum>
   <w:abstractNum w:abstractNumId="6" w15:restartNumberingAfterBreak="0">
+    <w:nsid w:val="64D17A7D"/>
+    <w:multiLevelType w:val="hybridMultilevel"/>
+    <w:tmpl w:val="EEACE04E"/>
+    <w:lvl w:ilvl="0" w:tplc="7DE898A2">
+      <w:start w:val="2"/>
+      <w:numFmt w:val="bullet"/>
+      <w:lvlText w:val="-"/>
+      <w:lvlJc w:val="left"/>
+      <w:pPr>
+        <w:ind w:left="720" w:hanging="360"/>
+      </w:pPr>
+      <w:rPr>
+        <w:rFonts w:ascii="Aptos" w:eastAsiaTheme="minorHAnsi" w:hAnsi="Aptos" w:cstheme="minorBidi" w:hint="default"/>
+      </w:rPr>
+    </w:lvl>
+    <w:lvl w:ilvl="1" w:tplc="04090003" w:tentative="1">
+      <w:start w:val="1"/>
+      <w:numFmt w:val="bullet"/>
+      <w:lvlText w:val="o"/>
+      <w:lvlJc w:val="left"/>
+      <w:pPr>
+        <w:ind w:left="1440" w:hanging="360"/>
+      </w:pPr>
+      <w:rPr>
+        <w:rFonts w:ascii="Courier New" w:hAnsi="Courier New" w:cs="Courier New" w:hint="default"/>
+      </w:rPr>
+    </w:lvl>
+    <w:lvl w:ilvl="2" w:tplc="04090005" w:tentative="1">
+      <w:start w:val="1"/>
+      <w:numFmt w:val="bullet"/>
+      <w:lvlText w:val=""/>
+      <w:lvlJc w:val="left"/>
+      <w:pPr>
+        <w:ind w:left="2160" w:hanging="360"/>
+      </w:pPr>
+      <w:rPr>
+        <w:rFonts w:ascii="Wingdings" w:hAnsi="Wingdings" w:hint="default"/>
+      </w:rPr>
+    </w:lvl>
+    <w:lvl w:ilvl="3" w:tplc="04090001" w:tentative="1">
+      <w:start w:val="1"/>
+      <w:numFmt w:val="bullet"/>
+      <w:lvlText w:val=""/>
+      <w:lvlJc w:val="left"/>
+      <w:pPr>
+        <w:ind w:left="2880" w:hanging="360"/>
+      </w:pPr>
+      <w:rPr>
+        <w:rFonts w:ascii="Symbol" w:hAnsi="Symbol" w:hint="default"/>
+      </w:rPr>
+    </w:lvl>
+    <w:lvl w:ilvl="4" w:tplc="04090003" w:tentative="1">
+      <w:start w:val="1"/>
+      <w:numFmt w:val="bullet"/>
+      <w:lvlText w:val="o"/>
+      <w:lvlJc w:val="left"/>
+      <w:pPr>
+        <w:ind w:left="3600" w:hanging="360"/>
+      </w:pPr>
+      <w:rPr>
+        <w:rFonts w:ascii="Courier New" w:hAnsi="Courier New" w:cs="Courier New" w:hint="default"/>
+      </w:rPr>
+    </w:lvl>
+    <w:lvl w:ilvl="5" w:tplc="04090005" w:tentative="1">
+      <w:start w:val="1"/>
+      <w:numFmt w:val="bullet"/>
+      <w:lvlText w:val=""/>
+      <w:lvlJc w:val="left"/>
+      <w:pPr>
+        <w:ind w:left="4320" w:hanging="360"/>
+      </w:pPr>
+      <w:rPr>
+        <w:rFonts w:ascii="Wingdings" w:hAnsi="Wingdings" w:hint="default"/>
+      </w:rPr>
+    </w:lvl>
+    <w:lvl w:ilvl="6" w:tplc="04090001" w:tentative="1">
+      <w:start w:val="1"/>
+      <w:numFmt w:val="bullet"/>
+      <w:lvlText w:val=""/>
+      <w:lvlJc w:val="left"/>
+      <w:pPr>
+        <w:ind w:left="5040" w:hanging="360"/>
+      </w:pPr>
+      <w:rPr>
+        <w:rFonts w:ascii="Symbol" w:hAnsi="Symbol" w:hint="default"/>
+      </w:rPr>
+    </w:lvl>
+    <w:lvl w:ilvl="7" w:tplc="04090003" w:tentative="1">
+      <w:start w:val="1"/>
+      <w:numFmt w:val="bullet"/>
+      <w:lvlText w:val="o"/>
+      <w:lvlJc w:val="left"/>
+      <w:pPr>
+        <w:ind w:left="5760" w:hanging="360"/>
+      </w:pPr>
+      <w:rPr>
+        <w:rFonts w:ascii="Courier New" w:hAnsi="Courier New" w:cs="Courier New" w:hint="default"/>
+      </w:rPr>
+    </w:lvl>
+    <w:lvl w:ilvl="8" w:tplc="04090005" w:tentative="1">
+      <w:start w:val="1"/>
+      <w:numFmt w:val="bullet"/>
+      <w:lvlText w:val=""/>
+      <w:lvlJc w:val="left"/>
+      <w:pPr>
+        <w:ind w:left="6480" w:hanging="360"/>
+      </w:pPr>
+      <w:rPr>
+        <w:rFonts w:ascii="Wingdings" w:hAnsi="Wingdings" w:hint="default"/>
+      </w:rPr>
+    </w:lvl>
+  </w:abstractNum>
+  <w:abstractNum w:abstractNumId="7" w15:restartNumberingAfterBreak="0">
     <w:nsid w:val="6A8833A4"/>
     <w:multiLevelType w:val="multilevel"/>
     <w:tmpl w:val="92C632D0"/>
@@ -3205,7 +3460,7 @@
       </w:pPr>
     </w:lvl>
   </w:abstractNum>
-  <w:abstractNum w:abstractNumId="7" w15:restartNumberingAfterBreak="0">
+  <w:abstractNum w:abstractNumId="8" w15:restartNumberingAfterBreak="0">
     <w:nsid w:val="6D4255CF"/>
     <w:multiLevelType w:val="multilevel"/>
     <w:tmpl w:val="5A56085A"/>
@@ -3354,7 +3609,7 @@
       </w:rPr>
     </w:lvl>
   </w:abstractNum>
-  <w:abstractNum w:abstractNumId="8" w15:restartNumberingAfterBreak="0">
+  <w:abstractNum w:abstractNumId="9" w15:restartNumberingAfterBreak="0">
     <w:nsid w:val="77CB6898"/>
     <w:multiLevelType w:val="multilevel"/>
     <w:tmpl w:val="DC36BE18"/>
@@ -3507,7 +3762,7 @@
     <w:abstractNumId w:val="2"/>
   </w:num>
   <w:num w:numId="2" w16cid:durableId="1613169805">
-    <w:abstractNumId w:val="6"/>
+    <w:abstractNumId w:val="7"/>
   </w:num>
   <w:num w:numId="3" w16cid:durableId="1949465958">
     <w:abstractNumId w:val="0"/>
@@ -3525,10 +3780,13 @@
     <w:abstractNumId w:val="5"/>
   </w:num>
   <w:num w:numId="8" w16cid:durableId="442387474">
+    <w:abstractNumId w:val="9"/>
+  </w:num>
+  <w:num w:numId="9" w16cid:durableId="1861625160">
     <w:abstractNumId w:val="8"/>
   </w:num>
-  <w:num w:numId="9" w16cid:durableId="1861625160">
-    <w:abstractNumId w:val="7"/>
+  <w:num w:numId="10" w16cid:durableId="264115782">
+    <w:abstractNumId w:val="6"/>
   </w:num>
 </w:numbering>
 </file>
@@ -4537,6 +4795,29 @@
     <w:uiPriority w:val="99"/>
     <w:rsid w:val="00951151"/>
   </w:style>
+  <w:style w:type="character" w:styleId="Hyperlink">
+    <w:name w:val="Hyperlink"/>
+    <w:basedOn w:val="DefaultParagraphFont"/>
+    <w:uiPriority w:val="99"/>
+    <w:unhideWhenUsed/>
+    <w:rsid w:val="004B57C9"/>
+    <w:rPr>
+      <w:color w:val="467886" w:themeColor="hyperlink"/>
+      <w:u w:val="single"/>
+    </w:rPr>
+  </w:style>
+  <w:style w:type="character" w:styleId="UnresolvedMention">
+    <w:name w:val="Unresolved Mention"/>
+    <w:basedOn w:val="DefaultParagraphFont"/>
+    <w:uiPriority w:val="99"/>
+    <w:semiHidden/>
+    <w:unhideWhenUsed/>
+    <w:rsid w:val="004B57C9"/>
+    <w:rPr>
+      <w:color w:val="605E5C"/>
+      <w:shd w:val="clear" w:color="auto" w:fill="E1DFDD"/>
+    </w:rPr>
+  </w:style>
 </w:styles>
 </file>
 

</xml_diff>